<commit_message>
Harden Alder task 072 scoring
</commit_message>
<xml_diff>
--- a/companies/alder-ridge/source-files/Shared/Finance/Reporting/2026/06 June/Q2 board + lender narrative review notes - 7.4 DC.docx
+++ b/companies/alder-ridge/source-files/Shared/Finance/Reporting/2026/06 June/Q2 board + lender narrative review notes - 7.4 DC.docx
@@ -551,7 +551,7 @@
                 <w:color w:val="000000"/>
                 <w:sz w:val="22"/>
               </w:rPr>
-              <w:t>Cash and capital, Full-year outlook, IR comparability bridge, Liquidity, Performance diagnostics, Q2 actual export, Q2 approved plan</w:t>
+              <w:t>Approved lender metric basis, Cash and capital, Full-year outlook, IR comparability bridge, Liquidity, Performance diagnostics, Q2 actual export, Q2 approved plan, Signed guidance decision</w:t>
             </w:r>
           </w:p>
         </w:tc>
@@ -584,7 +584,7 @@
                 <w:color w:val="000000"/>
                 <w:sz w:val="22"/>
               </w:rPr>
-              <w:t>Vista ERP P&amp;L, 2026-01-01 through 2026-06-30; Revenue total</w:t>
+              <w:t>Vista ERP balance sheet as of 2026-06-30; accounts 2200, 2210, and 2300; Vista ERP P&amp;L, 2026-01-01 through 2026-06-30; Revenue total</w:t>
             </w:r>
           </w:p>
         </w:tc>

</xml_diff>